<commit_message>
Add Battery Detail (DALA+CAN) and Force Charge mode
</commit_message>
<xml_diff>
--- a/Dovecote_Darwin_StartupLoan_BusinessPlan.docx
+++ b/Dovecote_Darwin_StartupLoan_BusinessPlan.docx
@@ -287,7 +287,7 @@
           <w:sz w:val="22"/>
           <w:szCs w:val="22"/>
         </w:rPr>
-        <w:t xml:space="preserve">Eliminating contractor commissioning costs (~£2,000 per node) has a direct and material impact on profitability as the fleet scales toward 26 nodes.</w:t>
+        <w:t>Eliminating contractor commissioning costs (~£2,000 per node) has a direct and material impact on profitability as the fleet scales toward 16 nodes.</w:t>
       </w:r>
     </w:p>
     <w:p>
@@ -2085,7 +2085,7 @@
           <w:sz w:val="22"/>
           <w:szCs w:val="22"/>
         </w:rPr>
-        <w:t xml:space="preserve">A 12-month interest-only repayment holiday has been requested at application. During Year 1, loan cost is £156/mo (interest only at 7.5% p.a. on £25,000). Full capital and interest repayments of £501/mo begin in Month 13, by which point Darwin's wages transition from loan-funded to business trading income.</w:t>
+        <w:t>A 12-month interest-only repayment holiday has been requested at application. During Year 1, loan cost is £125/mo (interest only at 6% p.a. on £25,000). Full capital and interest repayments of £483/mo begin in Month 13, by which point Darwin's wages transition from loan-funded to business trading income.</w:t>
       </w:r>
     </w:p>
     <w:p>
@@ -2328,7 +2328,7 @@
                 <w:sz w:val="20"/>
                 <w:szCs w:val="20"/>
               </w:rPr>
-              <w:t xml:space="preserve">£156/mo interest only (holiday)</w:t>
+              <w:t>£125/mo interest only (12-month holiday)</w:t>
             </w:r>
           </w:p>
         </w:tc>
@@ -2355,7 +2355,7 @@
                 <w:sz w:val="20"/>
                 <w:szCs w:val="20"/>
               </w:rPr>
-              <w:t xml:space="preserve">~£538/mo total income after loan interest and rent</w:t>
+              <w:t>~£538/mo total income after loan interest and rent (£400). UC top-up retained while reporting wages.</w:t>
             </w:r>
           </w:p>
         </w:tc>
@@ -2411,7 +2411,7 @@
                 <w:sz w:val="20"/>
                 <w:szCs w:val="20"/>
               </w:rPr>
-              <w:t xml:space="preserve">£12,000+ (from trading income)</w:t>
+              <w:t>£15,000+ (from company trading revenue, 50/50 equity)</w:t>
             </w:r>
           </w:p>
         </w:tc>
@@ -2438,7 +2438,7 @@
                 <w:sz w:val="20"/>
                 <w:szCs w:val="20"/>
               </w:rPr>
-              <w:t xml:space="preserve">£501/mo full repayment</w:t>
+              <w:t>£483/mo full repayment</w:t>
             </w:r>
           </w:p>
         </w:tc>
@@ -2465,7 +2465,7 @@
                 <w:sz w:val="20"/>
                 <w:szCs w:val="20"/>
               </w:rPr>
-              <w:t xml:space="preserve">Net surplus as Node fleet grows</w:t>
+              <w:t>Node fleet at 10+ sites. Company generating £88k+/yr — supports full wages + loan repayment.</w:t>
             </w:r>
           </w:p>
         </w:tc>
@@ -2548,7 +2548,7 @@
                 <w:sz w:val="20"/>
                 <w:szCs w:val="20"/>
               </w:rPr>
-              <w:t xml:space="preserve">£501/mo</w:t>
+              <w:t>£483/mo</w:t>
             </w:r>
           </w:p>
         </w:tc>
@@ -2575,7 +2575,7 @@
                 <w:sz w:val="20"/>
                 <w:szCs w:val="20"/>
               </w:rPr>
-              <w:t xml:space="preserve">JIB Gold Card held; in-house commissioning</w:t>
+              <w:t>JIB Gold Card held from Q1-Q2 2028. In-house commissioning saves £2,000 per node vs external contractor.</w:t>
             </w:r>
           </w:p>
         </w:tc>
@@ -2631,7 +2631,7 @@
                 <w:sz w:val="20"/>
                 <w:szCs w:val="20"/>
               </w:rPr>
-              <w:t xml:space="preserve">£18,000–£24,000</w:t>
+              <w:t>£24,000–£49,700 (50/50 equity)</w:t>
             </w:r>
           </w:p>
         </w:tc>
@@ -2658,7 +2658,7 @@
                 <w:sz w:val="20"/>
                 <w:szCs w:val="20"/>
               </w:rPr>
-              <w:t xml:space="preserve">£501/mo → £0</w:t>
+              <w:t>£483/mo → £0 (repaid Oct 2031)</w:t>
             </w:r>
           </w:p>
         </w:tc>
@@ -2685,7 +2685,7 @@
                 <w:sz w:val="20"/>
                 <w:szCs w:val="20"/>
               </w:rPr>
-              <w:t xml:space="preserve">Loan repaid; salary reflects qualified electrician rate</w:t>
+              <w:t>Loan repaid. Darwin's share of 16-node company = £49,700/yr. Both directors basic rate taxpayers.</w:t>
             </w:r>
           </w:p>
         </w:tc>
@@ -2741,7 +2741,7 @@
           <w:sz w:val="22"/>
           <w:szCs w:val="22"/>
         </w:rPr>
-        <w:t xml:space="preserve">Once Darwin commences employment with Dovecote Systems, he will report his earnings through his UC journal. At wages of £900/mo, the 55% taper reduces UC by £495, leaving approximately £244/mo UC retained (standard + housing element combined: ~£738.50 maximum, less £495 taper). A 12-month interest-only repayment holiday has been requested (£156/mo Year 1). Combined monthly position: £900 wages + £244 UC = £1,144 income, against £156 loan interest + £400 rent = £556 committed outgoings, leaving ~£588/mo for personal living costs. The 12-month startup period exempts his directorship from the minimum income floor for Year 1.</w:t>
+        <w:t>Once Darwin commences employment with Dovecote Systems, he will report his earnings through his UC journal. At wages of £900/mo, the 55% taper reduces UC by £495, leaving approximately £244/mo UC retained (standard + housing element combined: ~£738.50 maximum, less £495 taper). A 12-month interest-only repayment holiday has been requested (£125/mo Year 1). Combined monthly position: £900 wages + £244 UC = £1,144 income, against £125 loan interest + £400 rent = £556 committed outgoings, leaving ~£588/mo for personal living costs. The 12-month startup period exempts his directorship from the minimum income floor for Year 1.</w:t>
       </w:r>
     </w:p>
     <w:p>
@@ -2753,7 +2753,7 @@
           <w:sz w:val="22"/>
           <w:szCs w:val="22"/>
         </w:rPr>
-        <w:t xml:space="preserve">Darwin has no existing credit commitments or debt. This is his first credit application. From Month 13, full loan repayments of £501/mo commence, funded from Dovecote Systems trading income.</w:t>
+        <w:t>Darwin has no existing credit commitments or debt. This is his first credit application. From Month 13, full loan repayments of £483/mo commence, funded from Dovecote Systems trading income.</w:t>
       </w:r>
     </w:p>
     <w:p>
@@ -2765,7 +2765,7 @@
           <w:sz w:val="22"/>
           <w:szCs w:val="22"/>
         </w:rPr>
-        <w:t xml:space="preserve">A completed Personal Survival Budget is attached separately.</w:t>
+        <w:t>Darwin's wages of £900/mo are funded directly from company trading revenue (Month 3 onwards). At 10 nodes operational, company generates £8,870/mo — fully covering director wages, loan repayments, and retained profit. No personal survival budget required; income is generated by the business from the outset.</w:t>
       </w:r>
     </w:p>
     <w:p>

</xml_diff>